<commit_message>
Update Week 8 assignment docx
Updated Week 8 document
</commit_message>
<xml_diff>
--- a/Portfolio/Week_8/Week 8 assignment.docx
+++ b/Portfolio/Week_8/Week 8 assignment.docx
@@ -69,7 +69,21 @@
         <w:rPr>
           <w:lang w:val="en-US"/>
         </w:rPr>
-        <w:t>Task 1:  List regex that extracts dates from http://bit.ly/regexexercise2 and formats them as YYYY-MM-DD?</w:t>
+        <w:t>Task 1</w:t>
+      </w:r>
+      <w:proofErr w:type="gramStart"/>
+      <w:r>
+        <w:rPr>
+          <w:lang w:val="en-US"/>
+        </w:rPr>
+        <w:t>:  List</w:t>
+      </w:r>
+      <w:proofErr w:type="gramEnd"/>
+      <w:r>
+        <w:rPr>
+          <w:lang w:val="en-US"/>
+        </w:rPr>
+        <w:t xml:space="preserve"> regex that extracts dates from http://bit.ly/regexexercise2 and formats them as YYYY-MM-DD?</w:t>
       </w:r>
     </w:p>
     <w:p>
@@ -96,9 +110,15 @@
             <w:rStyle w:val="Hyperlink"/>
             <w:lang w:val="en-US"/>
           </w:rPr>
-          <w:t>https://regex101.com/r/1Jsmnf/2/substitution</w:t>
+          <w:t>https://regex101.com/r/1Jsmnf/3/substitution</w:t>
         </w:r>
       </w:hyperlink>
+      <w:r>
+        <w:rPr>
+          <w:lang w:val="en-US"/>
+        </w:rPr>
+        <w:t xml:space="preserve"> </w:t>
+      </w:r>
     </w:p>
     <w:p>
       <w:pPr>
@@ -130,8 +150,16 @@
         <w:rPr>
           <w:lang w:val="en-US"/>
         </w:rPr>
-        <w:t xml:space="preserve"> used collects day, month and year and puts them into three different groups, using parentheses. The periods (.) are left out of the parentheses, so they don’t end up in the wrong place later on</w:t>
-      </w:r>
+        <w:t xml:space="preserve"> used collects day, month and year and puts them into three different groups, using parentheses. The periods (.) are left out of the parentheses, so they don’t end up in the wrong place </w:t>
+      </w:r>
+      <w:proofErr w:type="gramStart"/>
+      <w:r>
+        <w:rPr>
+          <w:lang w:val="en-US"/>
+        </w:rPr>
+        <w:t>later on</w:t>
+      </w:r>
+      <w:proofErr w:type="gramEnd"/>
       <w:r>
         <w:rPr>
           <w:lang w:val="en-US"/>
@@ -149,19 +177,31 @@
         <w:rPr>
           <w:lang w:val="en-US"/>
         </w:rPr>
-        <w:t>The substitution takes the groups and places them in the YY</w:t>
-      </w:r>
-      <w:r>
-        <w:rPr>
-          <w:lang w:val="en-US"/>
-        </w:rPr>
-        <w:t>Y</w:t>
-      </w:r>
-      <w:r>
-        <w:rPr>
-          <w:lang w:val="en-US"/>
-        </w:rPr>
-        <w:t>Y-MM-DD format</w:t>
+        <w:t>The substitution takes the groups and places them in the</w:t>
+      </w:r>
+      <w:r>
+        <w:rPr>
+          <w:lang w:val="en-US"/>
+        </w:rPr>
+        <w:t xml:space="preserve"> ISO</w:t>
+      </w:r>
+      <w:r>
+        <w:rPr>
+          <w:lang w:val="en-US"/>
+        </w:rPr>
+        <w:t xml:space="preserve"> format</w:t>
+      </w:r>
+      <w:r>
+        <w:rPr>
+          <w:lang w:val="en-US"/>
+        </w:rPr>
+        <w:t xml:space="preserve"> </w:t>
+      </w:r>
+      <w:r>
+        <w:rPr>
+          <w:lang w:val="en-US"/>
+        </w:rPr>
+        <w:t>YYYY-MM-DD</w:t>
       </w:r>
       <w:r>
         <w:rPr>
@@ -263,6 +303,7 @@
           <w:lang w:val="en-US"/>
         </w:rPr>
       </w:pPr>
+      <w:proofErr w:type="gramStart"/>
       <w:r>
         <w:rPr>
           <w:lang w:val="en-US"/>
@@ -277,6 +318,7 @@
         <w:t>RegEx</w:t>
       </w:r>
       <w:proofErr w:type="spellEnd"/>
+      <w:proofErr w:type="gramEnd"/>
       <w:r>
         <w:rPr>
           <w:lang w:val="en-US"/>
@@ -295,7 +337,21 @@
         <w:rPr>
           <w:lang w:val="en-US"/>
         </w:rPr>
-        <w:t xml:space="preserve"> and it is then substituted with \n to create a new line instead. First and last citation mark will be removed manually as this is faster than trying to make a </w:t>
+        <w:t xml:space="preserve"> and it is then substituted with \n to create a new line instead. First and last citation </w:t>
+      </w:r>
+      <w:proofErr w:type="gramStart"/>
+      <w:r>
+        <w:rPr>
+          <w:lang w:val="en-US"/>
+        </w:rPr>
+        <w:t>mark</w:t>
+      </w:r>
+      <w:proofErr w:type="gramEnd"/>
+      <w:r>
+        <w:rPr>
+          <w:lang w:val="en-US"/>
+        </w:rPr>
+        <w:t xml:space="preserve"> will be removed manually as this is faster than trying to make a </w:t>
       </w:r>
       <w:proofErr w:type="spellStart"/>
       <w:r>
@@ -380,7 +436,21 @@
         <w:rPr>
           <w:lang w:val="en-US"/>
         </w:rPr>
-        <w:t xml:space="preserve"> grabs each time there is a new line, and then it is substituted with the correct formatting for R. (“, “). First and last citation mark will be added manually as this is faster than trying to make a </w:t>
+        <w:t xml:space="preserve"> grabs each time there is a new line, and then it is substituted with the correct formatting for R. (“, “). First and last citation </w:t>
+      </w:r>
+      <w:proofErr w:type="gramStart"/>
+      <w:r>
+        <w:rPr>
+          <w:lang w:val="en-US"/>
+        </w:rPr>
+        <w:t>mark</w:t>
+      </w:r>
+      <w:proofErr w:type="gramEnd"/>
+      <w:r>
+        <w:rPr>
+          <w:lang w:val="en-US"/>
+        </w:rPr>
+        <w:t xml:space="preserve"> will be added manually as this is faster than trying to make a </w:t>
       </w:r>
       <w:proofErr w:type="spellStart"/>
       <w:r>
@@ -549,8 +619,21 @@
           <w:szCs w:val="21"/>
           <w:lang w:val="en-US"/>
         </w:rPr>
-        <w:t>- Separator: ;</w:t>
-      </w:r>
+        <w:t>- Separator</w:t>
+      </w:r>
+      <w:proofErr w:type="gramStart"/>
+      <w:r>
+        <w:rPr>
+          <w:rFonts w:asciiTheme="majorHAnsi" w:hAnsiTheme="majorHAnsi" w:cs="Helvetica"/>
+          <w:color w:val="000000"/>
+          <w:spacing w:val="-5"/>
+          <w:sz w:val="21"/>
+          <w:szCs w:val="21"/>
+          <w:lang w:val="en-US"/>
+        </w:rPr>
+        <w:t>: ;</w:t>
+      </w:r>
+      <w:proofErr w:type="gramEnd"/>
     </w:p>
     <w:p>
       <w:pPr>
@@ -648,7 +731,21 @@
         <w:rPr>
           <w:lang w:val="en-US"/>
         </w:rPr>
-        <w:t>Task 5: Challenge - 10 most common occupations among ………………………….. in</w:t>
+        <w:t>Task 5: Challenge - 10 most common occupations among ………………………</w:t>
+      </w:r>
+      <w:proofErr w:type="gramStart"/>
+      <w:r>
+        <w:rPr>
+          <w:lang w:val="en-US"/>
+        </w:rPr>
+        <w:t>…..</w:t>
+      </w:r>
+      <w:proofErr w:type="gramEnd"/>
+      <w:r>
+        <w:rPr>
+          <w:lang w:val="en-US"/>
+        </w:rPr>
+        <w:t xml:space="preserve"> in</w:t>
       </w:r>
       <w:hyperlink r:id="rId9" w:history="1">
         <w:r>
@@ -817,7 +914,21 @@
         <w:rPr>
           <w:lang w:val="en-US"/>
         </w:rPr>
-        <w:t>I have only kept the primary jobs in the dataset i.e. deleting the job named second if several jobs were named. I have merged every occupation affiliated to the army as “</w:t>
+        <w:t xml:space="preserve">I have only kept the primary jobs in the </w:t>
+      </w:r>
+      <w:proofErr w:type="gramStart"/>
+      <w:r>
+        <w:rPr>
+          <w:lang w:val="en-US"/>
+        </w:rPr>
+        <w:t>dataset</w:t>
+      </w:r>
+      <w:proofErr w:type="gramEnd"/>
+      <w:r>
+        <w:rPr>
+          <w:lang w:val="en-US"/>
+        </w:rPr>
+        <w:t xml:space="preserve"> i.e. deleting the job named second if several jobs were named. I have merged every occupation affiliated to the army as “</w:t>
       </w:r>
       <w:proofErr w:type="spellStart"/>
       <w:r>
@@ -1434,6 +1545,7 @@
         </w:rPr>
         <w:t xml:space="preserve"> (After </w:t>
       </w:r>
+      <w:proofErr w:type="gramStart"/>
       <w:r>
         <w:rPr>
           <w:lang w:val="en-US"/>
@@ -1448,6 +1560,7 @@
         <w:t>tjenestekarl</w:t>
       </w:r>
       <w:proofErr w:type="spellEnd"/>
+      <w:proofErr w:type="gramEnd"/>
       <w:r>
         <w:rPr>
           <w:lang w:val="en-US"/>
@@ -1467,6 +1580,7 @@
         <w:t>rom “</w:t>
       </w:r>
       <w:proofErr w:type="spellStart"/>
+      <w:proofErr w:type="gramStart"/>
       <w:r>
         <w:rPr>
           <w:lang w:val="en-US"/>
@@ -1478,7 +1592,14 @@
         <w:rPr>
           <w:lang w:val="en-US"/>
         </w:rPr>
-        <w:t>“ to “</w:t>
+        <w:t>“ to</w:t>
+      </w:r>
+      <w:proofErr w:type="gramEnd"/>
+      <w:r>
+        <w:rPr>
+          <w:lang w:val="en-US"/>
+        </w:rPr>
+        <w:t xml:space="preserve"> “</w:t>
       </w:r>
       <w:proofErr w:type="spellStart"/>
       <w:r>
@@ -1501,6 +1622,7 @@
           <w:lang w:val="en-US"/>
         </w:rPr>
       </w:pPr>
+      <w:proofErr w:type="gramStart"/>
       <w:r>
         <w:rPr>
           <w:lang w:val="en-US"/>
@@ -1515,6 +1637,7 @@
         <w:t>famstand</w:t>
       </w:r>
       <w:proofErr w:type="spellEnd"/>
+      <w:proofErr w:type="gramEnd"/>
       <w:r>
         <w:rPr>
           <w:lang w:val="en-US"/>
@@ -1597,13 +1720,27 @@
         <w:rPr>
           <w:lang w:val="en-US"/>
         </w:rPr>
-        <w:t xml:space="preserve">” column </w:t>
-      </w:r>
-      <w:r>
-        <w:rPr>
-          <w:lang w:val="en-US"/>
-        </w:rPr>
-        <w:t xml:space="preserve"> -&gt; </w:t>
+        <w:t xml:space="preserve">” </w:t>
+      </w:r>
+      <w:proofErr w:type="gramStart"/>
+      <w:r>
+        <w:rPr>
+          <w:lang w:val="en-US"/>
+        </w:rPr>
+        <w:t xml:space="preserve">column </w:t>
+      </w:r>
+      <w:r>
+        <w:rPr>
+          <w:lang w:val="en-US"/>
+        </w:rPr>
+        <w:t xml:space="preserve"> -</w:t>
+      </w:r>
+      <w:proofErr w:type="gramEnd"/>
+      <w:r>
+        <w:rPr>
+          <w:lang w:val="en-US"/>
+        </w:rPr>
+        <w:t xml:space="preserve">&gt; </w:t>
       </w:r>
       <w:r>
         <w:rPr>

</xml_diff>

<commit_message>
Update Week 8 assignment document
Added cohort age in task 5
</commit_message>
<xml_diff>
--- a/Portfolio/Week_8/Week 8 assignment.docx
+++ b/Portfolio/Week_8/Week 8 assignment.docx
@@ -15,16 +15,8 @@
         <w:rPr>
           <w:lang w:val="en-US"/>
         </w:rPr>
-        <w:t xml:space="preserve">Prtf1 Regex and </w:t>
-      </w:r>
-      <w:proofErr w:type="spellStart"/>
-      <w:r>
-        <w:rPr>
-          <w:lang w:val="en-US"/>
-        </w:rPr>
-        <w:t>OpenRefine</w:t>
-      </w:r>
-      <w:proofErr w:type="spellEnd"/>
+        <w:t>Prtf1 Regex and OpenRefine</w:t>
+      </w:r>
     </w:p>
     <w:p>
       <w:pPr>
@@ -69,21 +61,7 @@
         <w:rPr>
           <w:lang w:val="en-US"/>
         </w:rPr>
-        <w:t>Task 1</w:t>
-      </w:r>
-      <w:proofErr w:type="gramStart"/>
-      <w:r>
-        <w:rPr>
-          <w:lang w:val="en-US"/>
-        </w:rPr>
-        <w:t>:  List</w:t>
-      </w:r>
-      <w:proofErr w:type="gramEnd"/>
-      <w:r>
-        <w:rPr>
-          <w:lang w:val="en-US"/>
-        </w:rPr>
-        <w:t xml:space="preserve"> regex that extracts dates from http://bit.ly/regexexercise2 and formats them as YYYY-MM-DD?</w:t>
+        <w:t>Task 1:  List regex that extracts dates from http://bit.ly/regexexercise2 and formats them as YYYY-MM-DD?</w:t>
       </w:r>
     </w:p>
     <w:p>
@@ -136,30 +114,8 @@
         <w:rPr>
           <w:lang w:val="en-US"/>
         </w:rPr>
-        <w:t xml:space="preserve"> The </w:t>
-      </w:r>
-      <w:proofErr w:type="spellStart"/>
-      <w:r>
-        <w:rPr>
-          <w:lang w:val="en-US"/>
-        </w:rPr>
-        <w:t>RegEx</w:t>
-      </w:r>
-      <w:proofErr w:type="spellEnd"/>
-      <w:r>
-        <w:rPr>
-          <w:lang w:val="en-US"/>
-        </w:rPr>
-        <w:t xml:space="preserve"> used collects day, month and year and puts them into three different groups, using parentheses. The periods (.) are left out of the parentheses, so they don’t end up in the wrong place </w:t>
-      </w:r>
-      <w:proofErr w:type="gramStart"/>
-      <w:r>
-        <w:rPr>
-          <w:lang w:val="en-US"/>
-        </w:rPr>
-        <w:t>later on</w:t>
-      </w:r>
-      <w:proofErr w:type="gramEnd"/>
+        <w:t xml:space="preserve"> The RegEx used collects day, month and year and puts them into three different groups, using parentheses. The periods (.) are left out of the parentheses, so they don’t end up in the wrong place later on</w:t>
+      </w:r>
       <w:r>
         <w:rPr>
           <w:lang w:val="en-US"/>
@@ -230,21 +186,7 @@
         <w:rPr>
           <w:lang w:val="en-US"/>
         </w:rPr>
-        <w:t xml:space="preserve">Task 2 Regex to convert </w:t>
-      </w:r>
-      <w:proofErr w:type="spellStart"/>
-      <w:r>
-        <w:rPr>
-          <w:lang w:val="en-US"/>
-        </w:rPr>
-        <w:t>stopwordlist</w:t>
-      </w:r>
-      <w:proofErr w:type="spellEnd"/>
-      <w:r>
-        <w:rPr>
-          <w:lang w:val="en-US"/>
-        </w:rPr>
-        <w:t xml:space="preserve"> between R and Voyant format</w:t>
+        <w:t>Task 2 Regex to convert stopwordlist between R and Voyant format</w:t>
       </w:r>
     </w:p>
     <w:p>
@@ -303,69 +245,11 @@
           <w:lang w:val="en-US"/>
         </w:rPr>
       </w:pPr>
-      <w:proofErr w:type="gramStart"/>
-      <w:r>
-        <w:rPr>
-          <w:lang w:val="en-US"/>
-        </w:rPr>
-        <w:t xml:space="preserve">The </w:t>
-      </w:r>
-      <w:proofErr w:type="spellStart"/>
-      <w:r>
-        <w:rPr>
-          <w:lang w:val="en-US"/>
-        </w:rPr>
-        <w:t>RegEx</w:t>
-      </w:r>
-      <w:proofErr w:type="spellEnd"/>
-      <w:proofErr w:type="gramEnd"/>
-      <w:r>
-        <w:rPr>
-          <w:lang w:val="en-US"/>
-        </w:rPr>
-        <w:t xml:space="preserve"> grabs everything unnecessary for an R-</w:t>
-      </w:r>
-      <w:proofErr w:type="spellStart"/>
-      <w:r>
-        <w:rPr>
-          <w:lang w:val="en-US"/>
-        </w:rPr>
-        <w:t>stopwordslist</w:t>
-      </w:r>
-      <w:proofErr w:type="spellEnd"/>
-      <w:r>
-        <w:rPr>
-          <w:lang w:val="en-US"/>
-        </w:rPr>
-        <w:t xml:space="preserve"> and it is then substituted with \n to create a new line instead. First and last citation </w:t>
-      </w:r>
-      <w:proofErr w:type="gramStart"/>
-      <w:r>
-        <w:rPr>
-          <w:lang w:val="en-US"/>
-        </w:rPr>
-        <w:t>mark</w:t>
-      </w:r>
-      <w:proofErr w:type="gramEnd"/>
-      <w:r>
-        <w:rPr>
-          <w:lang w:val="en-US"/>
-        </w:rPr>
-        <w:t xml:space="preserve"> will be removed manually as this is faster than trying to make a </w:t>
-      </w:r>
-      <w:proofErr w:type="spellStart"/>
-      <w:r>
-        <w:rPr>
-          <w:lang w:val="en-US"/>
-        </w:rPr>
-        <w:t>RegEx</w:t>
-      </w:r>
-      <w:proofErr w:type="spellEnd"/>
-      <w:r>
-        <w:rPr>
-          <w:lang w:val="en-US"/>
-        </w:rPr>
-        <w:t xml:space="preserve"> for it.</w:t>
+      <w:r>
+        <w:rPr>
+          <w:lang w:val="en-US"/>
+        </w:rPr>
+        <w:t>The RegEx grabs everything unnecessary for an R-stopwordslist and it is then substituted with \n to create a new line instead. First and last citation mark will be removed manually as this is faster than trying to make a RegEx for it.</w:t>
       </w:r>
     </w:p>
     <w:p>
@@ -424,47 +308,11 @@
           <w:lang w:val="en-US"/>
         </w:rPr>
       </w:pPr>
-      <w:proofErr w:type="spellStart"/>
-      <w:r>
-        <w:rPr>
-          <w:lang w:val="en-US"/>
-        </w:rPr>
-        <w:t>RegEx</w:t>
-      </w:r>
-      <w:proofErr w:type="spellEnd"/>
-      <w:r>
-        <w:rPr>
-          <w:lang w:val="en-US"/>
-        </w:rPr>
-        <w:t xml:space="preserve"> grabs each time there is a new line, and then it is substituted with the correct formatting for R. (“, “). First and last citation </w:t>
-      </w:r>
-      <w:proofErr w:type="gramStart"/>
-      <w:r>
-        <w:rPr>
-          <w:lang w:val="en-US"/>
-        </w:rPr>
-        <w:t>mark</w:t>
-      </w:r>
-      <w:proofErr w:type="gramEnd"/>
-      <w:r>
-        <w:rPr>
-          <w:lang w:val="en-US"/>
-        </w:rPr>
-        <w:t xml:space="preserve"> will be added manually as this is faster than trying to make a </w:t>
-      </w:r>
-      <w:proofErr w:type="spellStart"/>
-      <w:r>
-        <w:rPr>
-          <w:lang w:val="en-US"/>
-        </w:rPr>
-        <w:t>RegEx</w:t>
-      </w:r>
-      <w:proofErr w:type="spellEnd"/>
-      <w:r>
-        <w:rPr>
-          <w:lang w:val="en-US"/>
-        </w:rPr>
-        <w:t xml:space="preserve"> for it.</w:t>
+      <w:r>
+        <w:rPr>
+          <w:lang w:val="en-US"/>
+        </w:rPr>
+        <w:t>RegEx grabs each time there is a new line, and then it is substituted with the correct formatting for R. (“, “). First and last citation mark will be added manually as this is faster than trying to make a RegEx for it.</w:t>
       </w:r>
     </w:p>
     <w:p>
@@ -487,21 +335,7 @@
         <w:rPr>
           <w:lang w:val="en-US"/>
         </w:rPr>
-        <w:t xml:space="preserve">Task 3 Does </w:t>
-      </w:r>
-      <w:proofErr w:type="spellStart"/>
-      <w:r>
-        <w:rPr>
-          <w:lang w:val="en-US"/>
-        </w:rPr>
-        <w:t>OpenRefine</w:t>
-      </w:r>
-      <w:proofErr w:type="spellEnd"/>
-      <w:r>
-        <w:rPr>
-          <w:lang w:val="en-US"/>
-        </w:rPr>
-        <w:t xml:space="preserve"> alter the raw data during sorting and filtering?</w:t>
+        <w:t>Task 3 Does OpenRefine alter the raw data during sorting and filtering?</w:t>
       </w:r>
     </w:p>
     <w:p>
@@ -619,21 +453,8 @@
           <w:szCs w:val="21"/>
           <w:lang w:val="en-US"/>
         </w:rPr>
-        <w:t>- Separator</w:t>
-      </w:r>
-      <w:proofErr w:type="gramStart"/>
-      <w:r>
-        <w:rPr>
-          <w:rFonts w:asciiTheme="majorHAnsi" w:hAnsiTheme="majorHAnsi" w:cs="Helvetica"/>
-          <w:color w:val="000000"/>
-          <w:spacing w:val="-5"/>
-          <w:sz w:val="21"/>
-          <w:szCs w:val="21"/>
-          <w:lang w:val="en-US"/>
-        </w:rPr>
-        <w:t>: ;</w:t>
-      </w:r>
-      <w:proofErr w:type="gramEnd"/>
+        <w:t>- Separator: ;</w:t>
+      </w:r>
     </w:p>
     <w:p>
       <w:pPr>
@@ -731,21 +552,7 @@
         <w:rPr>
           <w:lang w:val="en-US"/>
         </w:rPr>
-        <w:t>Task 5: Challenge - 10 most common occupations among ………………………</w:t>
-      </w:r>
-      <w:proofErr w:type="gramStart"/>
-      <w:r>
-        <w:rPr>
-          <w:lang w:val="en-US"/>
-        </w:rPr>
-        <w:t>…..</w:t>
-      </w:r>
-      <w:proofErr w:type="gramEnd"/>
-      <w:r>
-        <w:rPr>
-          <w:lang w:val="en-US"/>
-        </w:rPr>
-        <w:t xml:space="preserve"> in</w:t>
+        <w:t>Task 5: Challenge - 10 most common occupations among ………………………….. in</w:t>
       </w:r>
       <w:hyperlink r:id="rId9" w:history="1">
         <w:r>
@@ -791,16 +598,14 @@
         <w:rPr>
           <w:lang w:val="en-US"/>
         </w:rPr>
-        <w:t>2760 (</w:t>
-      </w:r>
-      <w:proofErr w:type="spellStart"/>
-      <w:r>
-        <w:rPr>
-          <w:lang w:val="en-US"/>
-        </w:rPr>
-        <w:t>mand</w:t>
-      </w:r>
-      <w:proofErr w:type="spellEnd"/>
+        <w:t>2760 (mand</w:t>
+      </w:r>
+      <w:r>
+        <w:rPr>
+          <w:lang w:val="en-US"/>
+        </w:rPr>
+        <w:t>, age 20-30</w:t>
+      </w:r>
       <w:r>
         <w:rPr>
           <w:lang w:val="en-US"/>
@@ -871,35 +676,7 @@
         <w:rPr>
           <w:lang w:val="en-US"/>
         </w:rPr>
-        <w:t xml:space="preserve"> “Husmand med </w:t>
-      </w:r>
-      <w:proofErr w:type="spellStart"/>
-      <w:r>
-        <w:rPr>
-          <w:lang w:val="en-US"/>
-        </w:rPr>
-        <w:t>jord</w:t>
-      </w:r>
-      <w:proofErr w:type="spellEnd"/>
-      <w:r>
-        <w:rPr>
-          <w:lang w:val="en-US"/>
-        </w:rPr>
-        <w:t xml:space="preserve"> </w:t>
-      </w:r>
-      <w:proofErr w:type="spellStart"/>
-      <w:r>
-        <w:rPr>
-          <w:lang w:val="en-US"/>
-        </w:rPr>
-        <w:t>og</w:t>
-      </w:r>
-      <w:proofErr w:type="spellEnd"/>
-      <w:r>
-        <w:rPr>
-          <w:lang w:val="en-US"/>
-        </w:rPr>
-        <w:t xml:space="preserve"> Smed” will be marked as “Smed” </w:t>
+        <w:t xml:space="preserve"> “Husmand med jord og Smed” will be marked as “Smed” </w:t>
       </w:r>
     </w:p>
     <w:p>
@@ -914,77 +691,7 @@
         <w:rPr>
           <w:lang w:val="en-US"/>
         </w:rPr>
-        <w:t xml:space="preserve">I have only kept the primary jobs in the </w:t>
-      </w:r>
-      <w:proofErr w:type="gramStart"/>
-      <w:r>
-        <w:rPr>
-          <w:lang w:val="en-US"/>
-        </w:rPr>
-        <w:t>dataset</w:t>
-      </w:r>
-      <w:proofErr w:type="gramEnd"/>
-      <w:r>
-        <w:rPr>
-          <w:lang w:val="en-US"/>
-        </w:rPr>
-        <w:t xml:space="preserve"> i.e. deleting the job named second if several jobs were named. I have merged every occupation affiliated to the army as “</w:t>
-      </w:r>
-      <w:proofErr w:type="spellStart"/>
-      <w:r>
-        <w:rPr>
-          <w:lang w:val="en-US"/>
-        </w:rPr>
-        <w:t>soldat</w:t>
-      </w:r>
-      <w:proofErr w:type="spellEnd"/>
-      <w:r>
-        <w:rPr>
-          <w:lang w:val="en-US"/>
-        </w:rPr>
-        <w:t>” to simplify the process a lot. I have also gotten rid of the hierarchies in occupations, so “</w:t>
-      </w:r>
-      <w:proofErr w:type="spellStart"/>
-      <w:r>
-        <w:rPr>
-          <w:lang w:val="en-US"/>
-        </w:rPr>
-        <w:t>bager</w:t>
-      </w:r>
-      <w:proofErr w:type="spellEnd"/>
-      <w:r>
-        <w:rPr>
-          <w:lang w:val="en-US"/>
-        </w:rPr>
-        <w:t>” and “</w:t>
-      </w:r>
-      <w:proofErr w:type="spellStart"/>
-      <w:r>
-        <w:rPr>
-          <w:lang w:val="en-US"/>
-        </w:rPr>
-        <w:t>bagersvend</w:t>
-      </w:r>
-      <w:proofErr w:type="spellEnd"/>
-      <w:r>
-        <w:rPr>
-          <w:lang w:val="en-US"/>
-        </w:rPr>
-        <w:t>” have been merged into “</w:t>
-      </w:r>
-      <w:proofErr w:type="spellStart"/>
-      <w:r>
-        <w:rPr>
-          <w:lang w:val="en-US"/>
-        </w:rPr>
-        <w:t>bager</w:t>
-      </w:r>
-      <w:proofErr w:type="spellEnd"/>
-      <w:r>
-        <w:rPr>
-          <w:lang w:val="en-US"/>
-        </w:rPr>
-        <w:t>”.</w:t>
+        <w:t>I have only kept the primary jobs in the dataset i.e. deleting the job named second if several jobs were named. I have merged every occupation affiliated to the army as “soldat” to simplify the process a lot. I have also gotten rid of the hierarchies in occupations, so “bager” and “bagersvend” have been merged into “bager”.</w:t>
       </w:r>
       <w:r>
         <w:rPr>
@@ -1113,13 +820,8 @@
                             </w:r>
                           </w:p>
                           <w:p>
-                            <w:proofErr w:type="spellStart"/>
                             <w:r>
-                              <w:t>Skræder</w:t>
-                            </w:r>
-                            <w:proofErr w:type="spellEnd"/>
-                            <w:r>
-                              <w:t xml:space="preserve"> – 32</w:t>
+                              <w:t>Skræder – 32</w:t>
                             </w:r>
                           </w:p>
                           <w:p>
@@ -1375,13 +1077,8 @@
           <w:lang w:val="en-US"/>
         </w:rPr>
       </w:pPr>
-      <w:proofErr w:type="spellStart"/>
-      <w:r>
-        <w:t>Figure</w:t>
-      </w:r>
-      <w:proofErr w:type="spellEnd"/>
-      <w:r>
-        <w:t xml:space="preserve"> </w:t>
+      <w:r>
+        <w:t xml:space="preserve">Figure </w:t>
       </w:r>
       <w:fldSimple w:instr=" SEQ Figure \* ARABIC ">
         <w:r>
@@ -1392,23 +1089,10 @@
         </w:r>
       </w:fldSimple>
       <w:r>
-        <w:t xml:space="preserve"> (</w:t>
-      </w:r>
-      <w:proofErr w:type="spellStart"/>
-      <w:r>
-        <w:t>before</w:t>
-      </w:r>
-      <w:proofErr w:type="spellEnd"/>
-      <w:r>
-        <w:t xml:space="preserve"> </w:t>
-      </w:r>
-      <w:proofErr w:type="spellStart"/>
-      <w:r>
-        <w:t>moving</w:t>
-      </w:r>
-      <w:proofErr w:type="spellEnd"/>
-      <w:r>
-        <w:t xml:space="preserve"> ”tjenestekarl”</w:t>
+        <w:t xml:space="preserve"> (before </w:t>
+      </w:r>
+      <w:r>
+        <w:t>moving ”tjenestekarl”</w:t>
       </w:r>
     </w:p>
     <w:p>
@@ -1545,22 +1229,12 @@
         </w:rPr>
         <w:t xml:space="preserve"> (After </w:t>
       </w:r>
-      <w:proofErr w:type="gramStart"/>
-      <w:r>
-        <w:rPr>
-          <w:lang w:val="en-US"/>
-        </w:rPr>
-        <w:t>moving ”</w:t>
-      </w:r>
-      <w:proofErr w:type="spellStart"/>
-      <w:r>
-        <w:rPr>
-          <w:lang w:val="en-US"/>
-        </w:rPr>
-        <w:t>tjenestekarl</w:t>
-      </w:r>
-      <w:proofErr w:type="spellEnd"/>
-      <w:proofErr w:type="gramEnd"/>
+      <w:r>
+        <w:rPr>
+          <w:lang w:val="en-US"/>
+        </w:rPr>
+        <w:t>moving ”tjenestekarl</w:t>
+      </w:r>
       <w:r>
         <w:rPr>
           <w:lang w:val="en-US"/>
@@ -1577,72 +1251,20 @@
         <w:rPr>
           <w:lang w:val="en-US"/>
         </w:rPr>
-        <w:t>rom “</w:t>
-      </w:r>
-      <w:proofErr w:type="spellStart"/>
-      <w:proofErr w:type="gramStart"/>
-      <w:r>
-        <w:rPr>
-          <w:lang w:val="en-US"/>
-        </w:rPr>
-        <w:t>famstand</w:t>
-      </w:r>
-      <w:proofErr w:type="spellEnd"/>
-      <w:r>
-        <w:rPr>
-          <w:lang w:val="en-US"/>
-        </w:rPr>
-        <w:t>“ to</w:t>
-      </w:r>
-      <w:proofErr w:type="gramEnd"/>
-      <w:r>
-        <w:rPr>
-          <w:lang w:val="en-US"/>
-        </w:rPr>
-        <w:t xml:space="preserve"> “</w:t>
-      </w:r>
-      <w:proofErr w:type="spellStart"/>
-      <w:r>
-        <w:rPr>
-          <w:lang w:val="en-US"/>
-        </w:rPr>
-        <w:t>erhverv</w:t>
-      </w:r>
-      <w:proofErr w:type="spellEnd"/>
-      <w:r>
-        <w:rPr>
-          <w:lang w:val="en-US"/>
-        </w:rPr>
-        <w:t>”</w:t>
-      </w:r>
-    </w:p>
-    <w:p>
-      <w:pPr>
-        <w:rPr>
-          <w:lang w:val="en-US"/>
-        </w:rPr>
-      </w:pPr>
-      <w:proofErr w:type="gramStart"/>
-      <w:r>
-        <w:rPr>
-          <w:lang w:val="en-US"/>
-        </w:rPr>
-        <w:t>The ”</w:t>
-      </w:r>
-      <w:proofErr w:type="spellStart"/>
-      <w:r>
-        <w:rPr>
-          <w:lang w:val="en-US"/>
-        </w:rPr>
-        <w:t>famstand</w:t>
-      </w:r>
-      <w:proofErr w:type="spellEnd"/>
-      <w:proofErr w:type="gramEnd"/>
-      <w:r>
-        <w:rPr>
-          <w:lang w:val="en-US"/>
-        </w:rPr>
-        <w:t>” column had a l</w:t>
+        <w:t>rom “famstand“ to “erhverv”</w:t>
+      </w:r>
+    </w:p>
+    <w:p>
+      <w:pPr>
+        <w:rPr>
+          <w:lang w:val="en-US"/>
+        </w:rPr>
+      </w:pPr>
+      <w:r>
+        <w:rPr>
+          <w:lang w:val="en-US"/>
+        </w:rPr>
+        <w:t>The ”famstand” column had a l</w:t>
       </w:r>
       <w:r>
         <w:rPr>
@@ -1654,21 +1276,7 @@
         <w:rPr>
           <w:lang w:val="en-US"/>
         </w:rPr>
-        <w:t>the “</w:t>
-      </w:r>
-      <w:proofErr w:type="spellStart"/>
-      <w:r>
-        <w:rPr>
-          <w:lang w:val="en-US"/>
-        </w:rPr>
-        <w:t>erhverv</w:t>
-      </w:r>
-      <w:proofErr w:type="spellEnd"/>
-      <w:r>
-        <w:rPr>
-          <w:lang w:val="en-US"/>
-        </w:rPr>
-        <w:t>” column by</w:t>
+        <w:t>the “erhverv” column by</w:t>
       </w:r>
       <w:r>
         <w:rPr>
@@ -1680,21 +1288,7 @@
         <w:rPr>
           <w:lang w:val="en-US"/>
         </w:rPr>
-        <w:t>filtering to only show the “</w:t>
-      </w:r>
-      <w:proofErr w:type="spellStart"/>
-      <w:r>
-        <w:rPr>
-          <w:lang w:val="en-US"/>
-        </w:rPr>
-        <w:t>tjenestekarl</w:t>
-      </w:r>
-      <w:proofErr w:type="spellEnd"/>
-      <w:r>
-        <w:rPr>
-          <w:lang w:val="en-US"/>
-        </w:rPr>
-        <w:t>”, then</w:t>
+        <w:t>filtering to only show the “tjenestekarl”, then</w:t>
       </w:r>
       <w:r>
         <w:rPr>
@@ -1706,41 +1300,13 @@
         <w:rPr>
           <w:lang w:val="en-US"/>
         </w:rPr>
-        <w:t xml:space="preserve"> on “</w:t>
-      </w:r>
-      <w:proofErr w:type="spellStart"/>
-      <w:r>
-        <w:rPr>
-          <w:lang w:val="en-US"/>
-        </w:rPr>
-        <w:t>erhverv</w:t>
-      </w:r>
-      <w:proofErr w:type="spellEnd"/>
-      <w:r>
-        <w:rPr>
-          <w:lang w:val="en-US"/>
-        </w:rPr>
-        <w:t xml:space="preserve">” </w:t>
-      </w:r>
-      <w:proofErr w:type="gramStart"/>
-      <w:r>
-        <w:rPr>
-          <w:lang w:val="en-US"/>
-        </w:rPr>
-        <w:t xml:space="preserve">column </w:t>
-      </w:r>
-      <w:r>
-        <w:rPr>
-          <w:lang w:val="en-US"/>
-        </w:rPr>
-        <w:t xml:space="preserve"> -</w:t>
-      </w:r>
-      <w:proofErr w:type="gramEnd"/>
-      <w:r>
-        <w:rPr>
-          <w:lang w:val="en-US"/>
-        </w:rPr>
-        <w:t xml:space="preserve">&gt; </w:t>
+        <w:t xml:space="preserve"> on “erhverv” column </w:t>
+      </w:r>
+      <w:r>
+        <w:rPr>
+          <w:lang w:val="en-US"/>
+        </w:rPr>
+        <w:t xml:space="preserve"> -&gt; </w:t>
       </w:r>
       <w:r>
         <w:rPr>
@@ -1760,21 +1326,7 @@
         <w:rPr>
           <w:lang w:val="en-US"/>
         </w:rPr>
-        <w:t>cells["</w:t>
-      </w:r>
-      <w:proofErr w:type="spellStart"/>
-      <w:r>
-        <w:rPr>
-          <w:lang w:val="en-US"/>
-        </w:rPr>
-        <w:t>famstand</w:t>
-      </w:r>
-      <w:proofErr w:type="spellEnd"/>
-      <w:r>
-        <w:rPr>
-          <w:lang w:val="en-US"/>
-        </w:rPr>
-        <w:t>"].value</w:t>
+        <w:t>cells["famstand"].value</w:t>
       </w:r>
       <w:r>
         <w:rPr>
@@ -1793,35 +1345,7 @@
         <w:rPr>
           <w:lang w:val="en-US"/>
         </w:rPr>
-        <w:t>This moved all “</w:t>
-      </w:r>
-      <w:proofErr w:type="spellStart"/>
-      <w:r>
-        <w:rPr>
-          <w:lang w:val="en-US"/>
-        </w:rPr>
-        <w:t>tjenestekarl</w:t>
-      </w:r>
-      <w:proofErr w:type="spellEnd"/>
-      <w:r>
-        <w:rPr>
-          <w:lang w:val="en-US"/>
-        </w:rPr>
-        <w:t>” entries to the “</w:t>
-      </w:r>
-      <w:proofErr w:type="spellStart"/>
-      <w:r>
-        <w:rPr>
-          <w:lang w:val="en-US"/>
-        </w:rPr>
-        <w:t>erhverv</w:t>
-      </w:r>
-      <w:proofErr w:type="spellEnd"/>
-      <w:r>
-        <w:rPr>
-          <w:lang w:val="en-US"/>
-        </w:rPr>
-        <w:t>” column.</w:t>
+        <w:t>This moved all “tjenestekarl” entries to the “erhverv” column.</w:t>
       </w:r>
     </w:p>
     <w:sectPr>

</xml_diff>

<commit_message>
Updated week 8 assignment.docx
</commit_message>
<xml_diff>
--- a/Portfolio/Week_8/Week 8 assignment.docx
+++ b/Portfolio/Week_8/Week 8 assignment.docx
@@ -1,6 +1,6 @@
 
 <file path=word/document.xml><?xml version="1.0" encoding="utf-8"?>
-<w:document xmlns:wpc="http://schemas.microsoft.com/office/word/2010/wordprocessingCanvas" xmlns:cx="http://schemas.microsoft.com/office/drawing/2014/chartex" xmlns:cx1="http://schemas.microsoft.com/office/drawing/2015/9/8/chartex" xmlns:cx2="http://schemas.microsoft.com/office/drawing/2015/10/21/chartex" xmlns:cx3="http://schemas.microsoft.com/office/drawing/2016/5/9/chartex" xmlns:cx4="http://schemas.microsoft.com/office/drawing/2016/5/10/chartex" xmlns:cx5="http://schemas.microsoft.com/office/drawing/2016/5/11/chartex" xmlns:cx6="http://schemas.microsoft.com/office/drawing/2016/5/12/chartex" xmlns:cx7="http://schemas.microsoft.com/office/drawing/2016/5/13/chartex" xmlns:cx8="http://schemas.microsoft.com/office/drawing/2016/5/14/chartex" xmlns:mc="http://schemas.openxmlformats.org/markup-compatibility/2006" xmlns:aink="http://schemas.microsoft.com/office/drawing/2016/ink" xmlns:am3d="http://schemas.microsoft.com/office/drawing/2017/model3d" xmlns:o="urn:schemas-microsoft-com:office:office" xmlns:oel="http://schemas.microsoft.com/office/2019/extlst" xmlns:r="http://schemas.openxmlformats.org/officeDocument/2006/relationships" xmlns:m="http://schemas.openxmlformats.org/officeDocument/2006/math" xmlns:v="urn:schemas-microsoft-com:vml" xmlns:wp14="http://schemas.microsoft.com/office/word/2010/wordprocessingDrawing" xmlns:wp="http://schemas.openxmlformats.org/drawingml/2006/wordprocessingDrawing" xmlns:w10="urn:schemas-microsoft-com:office:word" xmlns:w="http://schemas.openxmlformats.org/wordprocessingml/2006/main" xmlns:w14="http://schemas.microsoft.com/office/word/2010/wordml" xmlns:w15="http://schemas.microsoft.com/office/word/2012/wordml" xmlns:w16cex="http://schemas.microsoft.com/office/word/2018/wordml/cex" xmlns:w16cid="http://schemas.microsoft.com/office/word/2016/wordml/cid" xmlns:w16="http://schemas.microsoft.com/office/word/2018/wordml" xmlns:w16du="http://schemas.microsoft.com/office/word/2023/wordml/word16du" xmlns:w16sdtdh="http://schemas.microsoft.com/office/word/2020/wordml/sdtdatahash" xmlns:w16sdtfl="http://schemas.microsoft.com/office/word/2024/wordml/sdtformatlock" xmlns:w16se="http://schemas.microsoft.com/office/word/2015/wordml/symex" xmlns:wpg="http://schemas.microsoft.com/office/word/2010/wordprocessingGroup" xmlns:wpi="http://schemas.microsoft.com/office/word/2010/wordprocessingInk" xmlns:wne="http://schemas.microsoft.com/office/word/2006/wordml" xmlns:wps="http://schemas.microsoft.com/office/word/2010/wordprocessingShape" mc:Ignorable="w14 w15 w16se w16cid w16 w16cex w16sdtdh w16sdtfl w16du wp14">
+<w:document xmlns:wpc="http://schemas.microsoft.com/office/word/2010/wordprocessingCanvas" xmlns:cx="http://schemas.microsoft.com/office/drawing/2014/chartex" xmlns:cx1="http://schemas.microsoft.com/office/drawing/2015/9/8/chartex" xmlns:cx2="http://schemas.microsoft.com/office/drawing/2015/10/21/chartex" xmlns:cx3="http://schemas.microsoft.com/office/drawing/2016/5/9/chartex" xmlns:cx4="http://schemas.microsoft.com/office/drawing/2016/5/10/chartex" xmlns:cx5="http://schemas.microsoft.com/office/drawing/2016/5/11/chartex" xmlns:cx6="http://schemas.microsoft.com/office/drawing/2016/5/12/chartex" xmlns:cx7="http://schemas.microsoft.com/office/drawing/2016/5/13/chartex" xmlns:cx8="http://schemas.microsoft.com/office/drawing/2016/5/14/chartex" xmlns:mc="http://schemas.openxmlformats.org/markup-compatibility/2006" xmlns:aink="http://schemas.microsoft.com/office/drawing/2016/ink" xmlns:am3d="http://schemas.microsoft.com/office/drawing/2017/model3d" xmlns:o="urn:schemas-microsoft-com:office:office" xmlns:oel="http://schemas.microsoft.com/office/2019/extlst" xmlns:r="http://schemas.openxmlformats.org/officeDocument/2006/relationships" xmlns:m="http://schemas.openxmlformats.org/officeDocument/2006/math" xmlns:v="urn:schemas-microsoft-com:vml" xmlns:wp14="http://schemas.microsoft.com/office/word/2010/wordprocessingDrawing" xmlns:wp="http://schemas.openxmlformats.org/drawingml/2006/wordprocessingDrawing" xmlns:w10="urn:schemas-microsoft-com:office:word" xmlns:w="http://schemas.openxmlformats.org/wordprocessingml/2006/main" xmlns:w14="http://schemas.microsoft.com/office/word/2010/wordml" xmlns:w15="http://schemas.microsoft.com/office/word/2012/wordml" xmlns:w16cei="http://schemas.microsoft.com/office/word/2026/wordml/cei" xmlns:w16cex="http://schemas.microsoft.com/office/word/2018/wordml/cex" xmlns:w16cid="http://schemas.microsoft.com/office/word/2016/wordml/cid" xmlns:w16="http://schemas.microsoft.com/office/word/2018/wordml" xmlns:w16du="http://schemas.microsoft.com/office/word/2023/wordml/word16du" xmlns:w16sdtdh="http://schemas.microsoft.com/office/word/2020/wordml/sdtdatahash" xmlns:w16sdtfl="http://schemas.microsoft.com/office/word/2024/wordml/sdtformatlock" xmlns:w16se="http://schemas.microsoft.com/office/word/2015/wordml/symex" xmlns:wpg="http://schemas.microsoft.com/office/word/2010/wordprocessingGroup" xmlns:wpi="http://schemas.microsoft.com/office/word/2010/wordprocessingInk" xmlns:wne="http://schemas.microsoft.com/office/word/2006/wordml" xmlns:wps="http://schemas.microsoft.com/office/word/2010/wordprocessingShape" mc:Ignorable="w14 w15 w16se w16cid w16 w16cex w16sdtdh w16sdtfl w16du wp14">
   <w:body>
     <w:p>
       <w:pPr>
@@ -15,8 +15,16 @@
         <w:rPr>
           <w:lang w:val="en-US"/>
         </w:rPr>
-        <w:t>Prtf1 Regex and OpenRefine</w:t>
-      </w:r>
+        <w:t xml:space="preserve">Prtf1 Regex and </w:t>
+      </w:r>
+      <w:proofErr w:type="spellStart"/>
+      <w:r>
+        <w:rPr>
+          <w:lang w:val="en-US"/>
+        </w:rPr>
+        <w:t>OpenRefine</w:t>
+      </w:r>
+      <w:proofErr w:type="spellEnd"/>
     </w:p>
     <w:p>
       <w:pPr>
@@ -61,26 +69,7 @@
         <w:rPr>
           <w:lang w:val="en-US"/>
         </w:rPr>
-        <w:t>Task 1:  List regex that extracts dates from http://bit.ly/regexexercise2 and formats them as YYYY-MM-DD?</w:t>
-      </w:r>
-    </w:p>
-    <w:p>
-      <w:pPr>
-        <w:rPr>
-          <w:lang w:val="en-US"/>
-        </w:rPr>
-      </w:pPr>
-      <w:r>
-        <w:rPr>
-          <w:lang w:val="en-US"/>
-        </w:rPr>
-        <w:t>URL for the solution:</w:t>
-      </w:r>
-      <w:r>
-        <w:rPr>
-          <w:lang w:val="en-US"/>
-        </w:rPr>
-        <w:t xml:space="preserve"> </w:t>
+        <w:t xml:space="preserve">Task 1: List regex that extracts dates from </w:t>
       </w:r>
       <w:hyperlink r:id="rId5" w:history="1">
         <w:r>
@@ -88,7 +77,7 @@
             <w:rStyle w:val="Hyperlink"/>
             <w:lang w:val="en-US"/>
           </w:rPr>
-          <w:t>https://regex101.com/r/1Jsmnf/3/substitution</w:t>
+          <w:t>http://bit.ly/regexexercise2</w:t>
         </w:r>
       </w:hyperlink>
       <w:r>
@@ -97,6 +86,66 @@
         </w:rPr>
         <w:t xml:space="preserve"> </w:t>
       </w:r>
+      <w:r>
+        <w:rPr>
+          <w:lang w:val="en-US"/>
+        </w:rPr>
+        <w:t>and formats them as YYYY-MM-DD</w:t>
+      </w:r>
+      <w:r>
+        <w:rPr>
+          <w:lang w:val="en-US"/>
+        </w:rPr>
+        <w:t>.</w:t>
+      </w:r>
+    </w:p>
+    <w:p>
+      <w:pPr>
+        <w:rPr>
+          <w:lang w:val="en-US"/>
+        </w:rPr>
+      </w:pPr>
+      <w:r>
+        <w:rPr>
+          <w:lang w:val="en-US"/>
+        </w:rPr>
+        <w:t>URL for the solution:</w:t>
+      </w:r>
+      <w:r>
+        <w:rPr>
+          <w:lang w:val="en-US"/>
+        </w:rPr>
+        <w:t xml:space="preserve"> </w:t>
+      </w:r>
+      <w:hyperlink r:id="rId6" w:history="1">
+        <w:r>
+          <w:rPr>
+            <w:rStyle w:val="Hyperlink"/>
+            <w:lang w:val="en-US"/>
+          </w:rPr>
+          <w:t>https://regex101.com/r/1Jsm</w:t>
+        </w:r>
+        <w:r>
+          <w:rPr>
+            <w:rStyle w:val="Hyperlink"/>
+            <w:lang w:val="en-US"/>
+          </w:rPr>
+          <w:t>n</w:t>
+        </w:r>
+        <w:r>
+          <w:rPr>
+            <w:rStyle w:val="Hyperlink"/>
+            <w:lang w:val="en-US"/>
+          </w:rPr>
+          <w:t>f/3/substitution</w:t>
+        </w:r>
+      </w:hyperlink>
+      <w:r>
+        <w:rPr>
+          <w:lang w:val="en-US"/>
+        </w:rPr>
+        <w:t xml:space="preserve"> </w:t>
+      </w:r>
     </w:p>
     <w:p>
       <w:pPr>
@@ -114,8 +163,30 @@
         <w:rPr>
           <w:lang w:val="en-US"/>
         </w:rPr>
-        <w:t xml:space="preserve"> The RegEx used collects day, month and year and puts them into three different groups, using parentheses. The periods (.) are left out of the parentheses, so they don’t end up in the wrong place later on</w:t>
-      </w:r>
+        <w:t xml:space="preserve"> The </w:t>
+      </w:r>
+      <w:proofErr w:type="spellStart"/>
+      <w:r>
+        <w:rPr>
+          <w:lang w:val="en-US"/>
+        </w:rPr>
+        <w:t>RegEx</w:t>
+      </w:r>
+      <w:proofErr w:type="spellEnd"/>
+      <w:r>
+        <w:rPr>
+          <w:lang w:val="en-US"/>
+        </w:rPr>
+        <w:t xml:space="preserve"> used collects day, month and year and puts them into three different groups, using parentheses. The periods (.) are left out of the parentheses, so they don’t end up in the wrong place </w:t>
+      </w:r>
+      <w:proofErr w:type="gramStart"/>
+      <w:r>
+        <w:rPr>
+          <w:lang w:val="en-US"/>
+        </w:rPr>
+        <w:t>later on</w:t>
+      </w:r>
+      <w:proofErr w:type="gramEnd"/>
       <w:r>
         <w:rPr>
           <w:lang w:val="en-US"/>
@@ -172,6 +243,211 @@
           <w:lang w:val="en-US"/>
         </w:rPr>
       </w:pPr>
+      <w:r>
+        <w:rPr>
+          <w:noProof/>
+        </w:rPr>
+        <mc:AlternateContent>
+          <mc:Choice Requires="wps">
+            <w:drawing>
+              <wp:anchor distT="0" distB="0" distL="114300" distR="114300" simplePos="0" relativeHeight="251661312" behindDoc="0" locked="0" layoutInCell="1" allowOverlap="1" wp14:anchorId="4637C9CE" wp14:editId="6545CF0E">
+                <wp:simplePos x="0" y="0"/>
+                <wp:positionH relativeFrom="column">
+                  <wp:posOffset>0</wp:posOffset>
+                </wp:positionH>
+                <wp:positionV relativeFrom="paragraph">
+                  <wp:posOffset>0</wp:posOffset>
+                </wp:positionV>
+                <wp:extent cx="1828800" cy="1828800"/>
+                <wp:effectExtent l="0" t="0" r="0" b="0"/>
+                <wp:wrapSquare wrapText="bothSides"/>
+                <wp:docPr id="1993731429" name="Tekstfelt 1"/>
+                <wp:cNvGraphicFramePr/>
+                <a:graphic xmlns:a="http://schemas.openxmlformats.org/drawingml/2006/main">
+                  <a:graphicData uri="http://schemas.microsoft.com/office/word/2010/wordprocessingShape">
+                    <wps:wsp>
+                      <wps:cNvSpPr txBox="1"/>
+                      <wps:spPr>
+                        <a:xfrm>
+                          <a:off x="0" y="0"/>
+                          <a:ext cx="1828800" cy="1828800"/>
+                        </a:xfrm>
+                        <a:prstGeom prst="rect">
+                          <a:avLst/>
+                        </a:prstGeom>
+                        <a:noFill/>
+                        <a:ln w="6350">
+                          <a:solidFill>
+                            <a:prstClr val="black"/>
+                          </a:solidFill>
+                        </a:ln>
+                      </wps:spPr>
+                      <wps:txbx>
+                        <w:txbxContent>
+                          <w:p>
+                            <w:pPr>
+                              <w:rPr>
+                                <w:lang w:val="en-US"/>
+                              </w:rPr>
+                            </w:pPr>
+                            <w:r>
+                              <w:rPr>
+                                <w:lang w:val="en-US"/>
+                              </w:rPr>
+                              <w:t>Note: The visible text of the link (</w:t>
+                            </w:r>
+                            <w:hyperlink r:id="rId7" w:history="1">
+                              <w:r>
+                                <w:rPr>
+                                  <w:rStyle w:val="Hyperlink"/>
+                                  <w:lang w:val="en-US"/>
+                                </w:rPr>
+                                <w:t>http:/</w:t>
+                              </w:r>
+                              <w:r>
+                                <w:rPr>
+                                  <w:rStyle w:val="Hyperlink"/>
+                                  <w:lang w:val="en-US"/>
+                                </w:rPr>
+                                <w:t>/</w:t>
+                              </w:r>
+                              <w:r>
+                                <w:rPr>
+                                  <w:rStyle w:val="Hyperlink"/>
+                                  <w:lang w:val="en-US"/>
+                                </w:rPr>
+                                <w:t>bit.ly/regexexercise2</w:t>
+                              </w:r>
+                            </w:hyperlink>
+                            <w:r>
+                              <w:rPr>
+                                <w:lang w:val="en-US"/>
+                              </w:rPr>
+                              <w:t>) and the actual hyperlink target lead</w:t>
+                            </w:r>
+                            <w:r>
+                              <w:rPr>
+                                <w:lang w:val="en-US"/>
+                              </w:rPr>
+                              <w:t>s</w:t>
+                            </w:r>
+                            <w:r>
+                              <w:rPr>
+                                <w:lang w:val="en-US"/>
+                              </w:rPr>
+                              <w:t xml:space="preserve"> to different source</w:t>
+                            </w:r>
+                            <w:r>
+                              <w:rPr>
+                                <w:lang w:val="en-US"/>
+                              </w:rPr>
+                              <w:t>s</w:t>
+                            </w:r>
+                            <w:r>
+                              <w:rPr>
+                                <w:lang w:val="en-US"/>
+                              </w:rPr>
+                              <w:t>. The solution above is for the text reached by clicking the link, which uses DD-MM-YYYY order. If the intended source is instead the one reached by pasting the visible URL directly (MM-DD-YYYY order), the same capture regex applies, but the substitution should be $3-$1-$2.</w:t>
+                            </w:r>
+                          </w:p>
+                        </w:txbxContent>
+                      </wps:txbx>
+                      <wps:bodyPr rot="0" spcFirstLastPara="0" vertOverflow="overflow" horzOverflow="overflow" vert="horz" wrap="none" lIns="91440" tIns="45720" rIns="91440" bIns="45720" numCol="1" spcCol="0" rtlCol="0" fromWordArt="0" anchor="t" anchorCtr="0" forceAA="0" compatLnSpc="1">
+                        <a:prstTxWarp prst="textNoShape">
+                          <a:avLst/>
+                        </a:prstTxWarp>
+                        <a:spAutoFit/>
+                      </wps:bodyPr>
+                    </wps:wsp>
+                  </a:graphicData>
+                </a:graphic>
+              </wp:anchor>
+            </w:drawing>
+          </mc:Choice>
+          <mc:Fallback>
+            <w:pict>
+              <v:shapetype w14:anchorId="4637C9CE" id="_x0000_t202" coordsize="21600,21600" o:spt="202" path="m,l,21600r21600,l21600,xe">
+                <v:stroke joinstyle="miter"/>
+                <v:path gradientshapeok="t" o:connecttype="rect"/>
+              </v:shapetype>
+              <v:shape id="Tekstfelt 1" o:spid="_x0000_s1026" type="#_x0000_t202" style="position:absolute;margin-left:0;margin-top:0;width:2in;height:2in;z-index:251661312;visibility:visible;mso-wrap-style:none;mso-wrap-distance-left:9pt;mso-wrap-distance-top:0;mso-wrap-distance-right:9pt;mso-wrap-distance-bottom:0;mso-position-horizontal:absolute;mso-position-horizontal-relative:text;mso-position-vertical:absolute;mso-position-vertical-relative:text;v-text-anchor:top" o:gfxdata="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" filled="f" strokeweight=".5pt">
+                <v:fill o:detectmouseclick="t"/>
+                <v:textbox style="mso-fit-shape-to-text:t">
+                  <w:txbxContent>
+                    <w:p>
+                      <w:pPr>
+                        <w:rPr>
+                          <w:lang w:val="en-US"/>
+                        </w:rPr>
+                      </w:pPr>
+                      <w:r>
+                        <w:rPr>
+                          <w:lang w:val="en-US"/>
+                        </w:rPr>
+                        <w:t>Note: The visible text of the link (</w:t>
+                      </w:r>
+                      <w:hyperlink r:id="rId8" w:history="1">
+                        <w:r>
+                          <w:rPr>
+                            <w:rStyle w:val="Hyperlink"/>
+                            <w:lang w:val="en-US"/>
+                          </w:rPr>
+                          <w:t>http:/</w:t>
+                        </w:r>
+                        <w:r>
+                          <w:rPr>
+                            <w:rStyle w:val="Hyperlink"/>
+                            <w:lang w:val="en-US"/>
+                          </w:rPr>
+                          <w:t>/</w:t>
+                        </w:r>
+                        <w:r>
+                          <w:rPr>
+                            <w:rStyle w:val="Hyperlink"/>
+                            <w:lang w:val="en-US"/>
+                          </w:rPr>
+                          <w:t>bit.ly/regexexercise2</w:t>
+                        </w:r>
+                      </w:hyperlink>
+                      <w:r>
+                        <w:rPr>
+                          <w:lang w:val="en-US"/>
+                        </w:rPr>
+                        <w:t>) and the actual hyperlink target lead</w:t>
+                      </w:r>
+                      <w:r>
+                        <w:rPr>
+                          <w:lang w:val="en-US"/>
+                        </w:rPr>
+                        <w:t>s</w:t>
+                      </w:r>
+                      <w:r>
+                        <w:rPr>
+                          <w:lang w:val="en-US"/>
+                        </w:rPr>
+                        <w:t xml:space="preserve"> to different source</w:t>
+                      </w:r>
+                      <w:r>
+                        <w:rPr>
+                          <w:lang w:val="en-US"/>
+                        </w:rPr>
+                        <w:t>s</w:t>
+                      </w:r>
+                      <w:r>
+                        <w:rPr>
+                          <w:lang w:val="en-US"/>
+                        </w:rPr>
+                        <w:t>. The solution above is for the text reached by clicking the link, which uses DD-MM-YYYY order. If the intended source is instead the one reached by pasting the visible URL directly (MM-DD-YYYY order), the same capture regex applies, but the substitution should be $3-$1-$2.</w:t>
+                      </w:r>
+                    </w:p>
+                  </w:txbxContent>
+                </v:textbox>
+                <w10:wrap type="square"/>
+              </v:shape>
+            </w:pict>
+          </mc:Fallback>
+        </mc:AlternateContent>
+      </w:r>
     </w:p>
     <w:p>
       <w:pPr>
@@ -186,7 +462,21 @@
         <w:rPr>
           <w:lang w:val="en-US"/>
         </w:rPr>
-        <w:t>Task 2 Regex to convert stopwordlist between R and Voyant format</w:t>
+        <w:t xml:space="preserve">Task 2 Regex to convert </w:t>
+      </w:r>
+      <w:proofErr w:type="spellStart"/>
+      <w:r>
+        <w:rPr>
+          <w:lang w:val="en-US"/>
+        </w:rPr>
+        <w:t>stopwordlist</w:t>
+      </w:r>
+      <w:proofErr w:type="spellEnd"/>
+      <w:r>
+        <w:rPr>
+          <w:lang w:val="en-US"/>
+        </w:rPr>
+        <w:t xml:space="preserve"> between R and Voyant format</w:t>
       </w:r>
     </w:p>
     <w:p>
@@ -212,7 +502,7 @@
           <w:lang w:val="en-US"/>
         </w:rPr>
       </w:pPr>
-      <w:hyperlink r:id="rId6" w:history="1">
+      <w:hyperlink r:id="rId9" w:history="1">
         <w:r>
           <w:rPr>
             <w:rStyle w:val="Hyperlink"/>
@@ -245,11 +535,71 @@
           <w:lang w:val="en-US"/>
         </w:rPr>
       </w:pPr>
-      <w:r>
-        <w:rPr>
-          <w:lang w:val="en-US"/>
-        </w:rPr>
-        <w:t>The RegEx grabs everything unnecessary for an R-stopwordslist and it is then substituted with \n to create a new line instead. First and last citation mark will be removed manually as this is faster than trying to make a RegEx for it.</w:t>
+      <w:proofErr w:type="gramStart"/>
+      <w:r>
+        <w:rPr>
+          <w:lang w:val="en-US"/>
+        </w:rPr>
+        <w:t xml:space="preserve">The </w:t>
+      </w:r>
+      <w:proofErr w:type="spellStart"/>
+      <w:r>
+        <w:rPr>
+          <w:lang w:val="en-US"/>
+        </w:rPr>
+        <w:t>RegEx</w:t>
+      </w:r>
+      <w:proofErr w:type="spellEnd"/>
+      <w:proofErr w:type="gramEnd"/>
+      <w:r>
+        <w:rPr>
+          <w:lang w:val="en-US"/>
+        </w:rPr>
+        <w:t xml:space="preserve"> grabs everything unnecessary for an R-</w:t>
+      </w:r>
+      <w:proofErr w:type="spellStart"/>
+      <w:proofErr w:type="gramStart"/>
+      <w:r>
+        <w:rPr>
+          <w:lang w:val="en-US"/>
+        </w:rPr>
+        <w:t>stopwordslist</w:t>
+      </w:r>
+      <w:proofErr w:type="spellEnd"/>
+      <w:proofErr w:type="gramEnd"/>
+      <w:r>
+        <w:rPr>
+          <w:lang w:val="en-US"/>
+        </w:rPr>
+        <w:t xml:space="preserve"> and it is then substituted with \n to create a new line instead. First and last citation </w:t>
+      </w:r>
+      <w:proofErr w:type="gramStart"/>
+      <w:r>
+        <w:rPr>
+          <w:lang w:val="en-US"/>
+        </w:rPr>
+        <w:t>mark</w:t>
+      </w:r>
+      <w:proofErr w:type="gramEnd"/>
+      <w:r>
+        <w:rPr>
+          <w:lang w:val="en-US"/>
+        </w:rPr>
+        <w:t xml:space="preserve"> will be removed manually as this is faster than trying to make a </w:t>
+      </w:r>
+      <w:proofErr w:type="spellStart"/>
+      <w:r>
+        <w:rPr>
+          <w:lang w:val="en-US"/>
+        </w:rPr>
+        <w:t>RegEx</w:t>
+      </w:r>
+      <w:proofErr w:type="spellEnd"/>
+      <w:r>
+        <w:rPr>
+          <w:lang w:val="en-US"/>
+        </w:rPr>
+        <w:t xml:space="preserve"> for it.</w:t>
       </w:r>
     </w:p>
     <w:p>
@@ -275,7 +625,7 @@
           <w:lang w:val="en-US"/>
         </w:rPr>
       </w:pPr>
-      <w:hyperlink r:id="rId7" w:history="1">
+      <w:hyperlink r:id="rId10" w:history="1">
         <w:r>
           <w:rPr>
             <w:rStyle w:val="Hyperlink"/>
@@ -308,11 +658,47 @@
           <w:lang w:val="en-US"/>
         </w:rPr>
       </w:pPr>
-      <w:r>
-        <w:rPr>
-          <w:lang w:val="en-US"/>
-        </w:rPr>
-        <w:t>RegEx grabs each time there is a new line, and then it is substituted with the correct formatting for R. (“, “). First and last citation mark will be added manually as this is faster than trying to make a RegEx for it.</w:t>
+      <w:proofErr w:type="spellStart"/>
+      <w:r>
+        <w:rPr>
+          <w:lang w:val="en-US"/>
+        </w:rPr>
+        <w:t>RegEx</w:t>
+      </w:r>
+      <w:proofErr w:type="spellEnd"/>
+      <w:r>
+        <w:rPr>
+          <w:lang w:val="en-US"/>
+        </w:rPr>
+        <w:t xml:space="preserve"> grabs each time there is a new line, and then it is substituted with the correct formatting for R. (“, “). First and last citation </w:t>
+      </w:r>
+      <w:proofErr w:type="gramStart"/>
+      <w:r>
+        <w:rPr>
+          <w:lang w:val="en-US"/>
+        </w:rPr>
+        <w:t>mark</w:t>
+      </w:r>
+      <w:proofErr w:type="gramEnd"/>
+      <w:r>
+        <w:rPr>
+          <w:lang w:val="en-US"/>
+        </w:rPr>
+        <w:t xml:space="preserve"> will be added manually as this is faster than trying to make a </w:t>
+      </w:r>
+      <w:proofErr w:type="spellStart"/>
+      <w:r>
+        <w:rPr>
+          <w:lang w:val="en-US"/>
+        </w:rPr>
+        <w:t>RegEx</w:t>
+      </w:r>
+      <w:proofErr w:type="spellEnd"/>
+      <w:r>
+        <w:rPr>
+          <w:lang w:val="en-US"/>
+        </w:rPr>
+        <w:t xml:space="preserve"> for it.</w:t>
       </w:r>
     </w:p>
     <w:p>
@@ -335,7 +721,21 @@
         <w:rPr>
           <w:lang w:val="en-US"/>
         </w:rPr>
-        <w:t>Task 3 Does OpenRefine alter the raw data during sorting and filtering?</w:t>
+        <w:t xml:space="preserve">Task 3 Does </w:t>
+      </w:r>
+      <w:proofErr w:type="spellStart"/>
+      <w:r>
+        <w:rPr>
+          <w:lang w:val="en-US"/>
+        </w:rPr>
+        <w:t>OpenRefine</w:t>
+      </w:r>
+      <w:proofErr w:type="spellEnd"/>
+      <w:r>
+        <w:rPr>
+          <w:lang w:val="en-US"/>
+        </w:rPr>
+        <w:t xml:space="preserve"> alter the raw data during sorting and filtering?</w:t>
       </w:r>
     </w:p>
     <w:p>
@@ -380,7 +780,6 @@
         <w:rPr>
           <w:lang w:val="en-US"/>
         </w:rPr>
-        <w:lastRenderedPageBreak/>
         <w:t>Task 4:  What are the two most water-deprived months in Mozambique and Tanzania?</w:t>
       </w:r>
     </w:p>
@@ -453,8 +852,21 @@
           <w:szCs w:val="21"/>
           <w:lang w:val="en-US"/>
         </w:rPr>
-        <w:t>- Separator: ;</w:t>
-      </w:r>
+        <w:t>- Separator</w:t>
+      </w:r>
+      <w:proofErr w:type="gramStart"/>
+      <w:r>
+        <w:rPr>
+          <w:rFonts w:asciiTheme="majorHAnsi" w:hAnsiTheme="majorHAnsi" w:cs="Helvetica"/>
+          <w:color w:val="000000"/>
+          <w:spacing w:val="-5"/>
+          <w:sz w:val="21"/>
+          <w:szCs w:val="21"/>
+          <w:lang w:val="en-US"/>
+        </w:rPr>
+        <w:t>: ;</w:t>
+      </w:r>
+      <w:proofErr w:type="gramEnd"/>
     </w:p>
     <w:p>
       <w:pPr>
@@ -495,7 +907,7 @@
                     <pic:cNvPicPr/>
                   </pic:nvPicPr>
                   <pic:blipFill>
-                    <a:blip r:embed="rId8"/>
+                    <a:blip r:embed="rId11"/>
                     <a:stretch>
                       <a:fillRect/>
                     </a:stretch>
@@ -552,9 +964,21 @@
         <w:rPr>
           <w:lang w:val="en-US"/>
         </w:rPr>
-        <w:t>Task 5: Challenge - 10 most common occupations among ………………………….. in</w:t>
-      </w:r>
-      <w:hyperlink r:id="rId9" w:history="1">
+        <w:t xml:space="preserve">Task 5: Challenge - 10 most common occupations among </w:t>
+      </w:r>
+      <w:r>
+        <w:rPr>
+          <w:lang w:val="en-US"/>
+        </w:rPr>
+        <w:t xml:space="preserve">males age 20-30 </w:t>
+      </w:r>
+      <w:r>
+        <w:rPr>
+          <w:lang w:val="en-US"/>
+        </w:rPr>
+        <w:t>in</w:t>
+      </w:r>
+      <w:hyperlink r:id="rId12" w:history="1">
         <w:r>
           <w:rPr>
             <w:rStyle w:val="Hyperlink"/>
@@ -598,8 +1022,16 @@
         <w:rPr>
           <w:lang w:val="en-US"/>
         </w:rPr>
-        <w:t>2760 (mand</w:t>
-      </w:r>
+        <w:t>2760 (</w:t>
+      </w:r>
+      <w:proofErr w:type="spellStart"/>
+      <w:r>
+        <w:rPr>
+          <w:lang w:val="en-US"/>
+        </w:rPr>
+        <w:t>mand</w:t>
+      </w:r>
+      <w:proofErr w:type="spellEnd"/>
       <w:r>
         <w:rPr>
           <w:lang w:val="en-US"/>
@@ -676,7 +1108,35 @@
         <w:rPr>
           <w:lang w:val="en-US"/>
         </w:rPr>
-        <w:t xml:space="preserve"> “Husmand med jord og Smed” will be marked as “Smed” </w:t>
+        <w:t xml:space="preserve"> “Husmand med </w:t>
+      </w:r>
+      <w:proofErr w:type="spellStart"/>
+      <w:r>
+        <w:rPr>
+          <w:lang w:val="en-US"/>
+        </w:rPr>
+        <w:t>jord</w:t>
+      </w:r>
+      <w:proofErr w:type="spellEnd"/>
+      <w:r>
+        <w:rPr>
+          <w:lang w:val="en-US"/>
+        </w:rPr>
+        <w:t xml:space="preserve"> </w:t>
+      </w:r>
+      <w:proofErr w:type="spellStart"/>
+      <w:r>
+        <w:rPr>
+          <w:lang w:val="en-US"/>
+        </w:rPr>
+        <w:t>og</w:t>
+      </w:r>
+      <w:proofErr w:type="spellEnd"/>
+      <w:r>
+        <w:rPr>
+          <w:lang w:val="en-US"/>
+        </w:rPr>
+        <w:t xml:space="preserve"> Smed” will be marked as “Smed” </w:t>
       </w:r>
     </w:p>
     <w:p>
@@ -691,7 +1151,84 @@
         <w:rPr>
           <w:lang w:val="en-US"/>
         </w:rPr>
-        <w:t>I have only kept the primary jobs in the dataset i.e. deleting the job named second if several jobs were named. I have merged every occupation affiliated to the army as “soldat” to simplify the process a lot. I have also gotten rid of the hierarchies in occupations, so “bager” and “bagersvend” have been merged into “bager”.</w:t>
+        <w:t xml:space="preserve">I have only kept the primary jobs in the </w:t>
+      </w:r>
+      <w:proofErr w:type="gramStart"/>
+      <w:r>
+        <w:rPr>
+          <w:lang w:val="en-US"/>
+        </w:rPr>
+        <w:t>dataset</w:t>
+      </w:r>
+      <w:proofErr w:type="gramEnd"/>
+      <w:r>
+        <w:rPr>
+          <w:lang w:val="en-US"/>
+        </w:rPr>
+        <w:t xml:space="preserve"> i.e. deleting the job named second if several jobs were named. I have merged every occupation affiliated to the army as “</w:t>
+      </w:r>
+      <w:proofErr w:type="spellStart"/>
+      <w:r>
+        <w:rPr>
+          <w:lang w:val="en-US"/>
+        </w:rPr>
+        <w:t>soldat</w:t>
+      </w:r>
+      <w:proofErr w:type="spellEnd"/>
+      <w:r>
+        <w:rPr>
+          <w:lang w:val="en-US"/>
+        </w:rPr>
+        <w:t>” to simplify the process a lot. I have also gotten rid of the hierarchies in occupations, so “</w:t>
+      </w:r>
+      <w:proofErr w:type="spellStart"/>
+      <w:r>
+        <w:rPr>
+          <w:lang w:val="en-US"/>
+        </w:rPr>
+        <w:t>bager</w:t>
+      </w:r>
+      <w:proofErr w:type="spellEnd"/>
+      <w:r>
+        <w:rPr>
+          <w:lang w:val="en-US"/>
+        </w:rPr>
+        <w:t xml:space="preserve">” and </w:t>
+      </w:r>
+      <w:r>
+        <w:rPr>
+          <w:lang w:val="en-US"/>
+        </w:rPr>
+        <w:lastRenderedPageBreak/>
+        <w:t>“</w:t>
+      </w:r>
+      <w:proofErr w:type="spellStart"/>
+      <w:r>
+        <w:rPr>
+          <w:lang w:val="en-US"/>
+        </w:rPr>
+        <w:t>bagersvend</w:t>
+      </w:r>
+      <w:proofErr w:type="spellEnd"/>
+      <w:r>
+        <w:rPr>
+          <w:lang w:val="en-US"/>
+        </w:rPr>
+        <w:t>” have been merged into “</w:t>
+      </w:r>
+      <w:proofErr w:type="spellStart"/>
+      <w:r>
+        <w:rPr>
+          <w:lang w:val="en-US"/>
+        </w:rPr>
+        <w:t>bager</w:t>
+      </w:r>
+      <w:proofErr w:type="spellEnd"/>
+      <w:r>
+        <w:rPr>
+          <w:lang w:val="en-US"/>
+        </w:rPr>
+        <w:t>”.</w:t>
       </w:r>
       <w:r>
         <w:rPr>
@@ -716,7 +1253,6 @@
         <w:rPr>
           <w:noProof/>
         </w:rPr>
-        <w:lastRenderedPageBreak/>
         <mc:AlternateContent>
           <mc:Choice Requires="wps">
             <w:drawing>
@@ -820,8 +1356,13 @@
                             </w:r>
                           </w:p>
                           <w:p>
+                            <w:proofErr w:type="spellStart"/>
                             <w:r>
-                              <w:t>Skræder – 32</w:t>
+                              <w:t>Skræder</w:t>
+                            </w:r>
+                            <w:proofErr w:type="spellEnd"/>
+                            <w:r>
+                              <w:t xml:space="preserve"> – 32</w:t>
                             </w:r>
                           </w:p>
                           <w:p>
@@ -1049,7 +1590,7 @@
                     <pic:cNvPicPr/>
                   </pic:nvPicPr>
                   <pic:blipFill>
-                    <a:blip r:embed="rId10"/>
+                    <a:blip r:embed="rId13"/>
                     <a:stretch>
                       <a:fillRect/>
                     </a:stretch>
@@ -1077,8 +1618,13 @@
           <w:lang w:val="en-US"/>
         </w:rPr>
       </w:pPr>
-      <w:r>
-        <w:t xml:space="preserve">Figure </w:t>
+      <w:proofErr w:type="spellStart"/>
+      <w:r>
+        <w:t>Figure</w:t>
+      </w:r>
+      <w:proofErr w:type="spellEnd"/>
+      <w:r>
+        <w:t xml:space="preserve"> </w:t>
       </w:r>
       <w:fldSimple w:instr=" SEQ Figure \* ARABIC ">
         <w:r>
@@ -1089,10 +1635,23 @@
         </w:r>
       </w:fldSimple>
       <w:r>
-        <w:t xml:space="preserve"> (before </w:t>
-      </w:r>
-      <w:r>
-        <w:t>moving ”tjenestekarl”</w:t>
+        <w:t xml:space="preserve"> (</w:t>
+      </w:r>
+      <w:proofErr w:type="spellStart"/>
+      <w:r>
+        <w:t>before</w:t>
+      </w:r>
+      <w:proofErr w:type="spellEnd"/>
+      <w:r>
+        <w:t xml:space="preserve"> </w:t>
+      </w:r>
+      <w:proofErr w:type="spellStart"/>
+      <w:r>
+        <w:t>moving</w:t>
+      </w:r>
+      <w:proofErr w:type="spellEnd"/>
+      <w:r>
+        <w:t xml:space="preserve"> ”tjenestekarl”</w:t>
       </w:r>
     </w:p>
     <w:p>
@@ -1122,7 +1681,7 @@
                     <pic:cNvPicPr/>
                   </pic:nvPicPr>
                   <pic:blipFill>
-                    <a:blip r:embed="rId11"/>
+                    <a:blip r:embed="rId14"/>
                     <a:stretch>
                       <a:fillRect/>
                     </a:stretch>
@@ -1167,7 +1726,7 @@
                     <pic:cNvPicPr/>
                   </pic:nvPicPr>
                   <pic:blipFill>
-                    <a:blip r:embed="rId12"/>
+                    <a:blip r:embed="rId15"/>
                     <a:stretch>
                       <a:fillRect/>
                     </a:stretch>
@@ -1229,12 +1788,22 @@
         </w:rPr>
         <w:t xml:space="preserve"> (After </w:t>
       </w:r>
-      <w:r>
-        <w:rPr>
-          <w:lang w:val="en-US"/>
-        </w:rPr>
-        <w:t>moving ”tjenestekarl</w:t>
-      </w:r>
+      <w:proofErr w:type="gramStart"/>
+      <w:r>
+        <w:rPr>
+          <w:lang w:val="en-US"/>
+        </w:rPr>
+        <w:t>moving ”</w:t>
+      </w:r>
+      <w:proofErr w:type="spellStart"/>
+      <w:r>
+        <w:rPr>
+          <w:lang w:val="en-US"/>
+        </w:rPr>
+        <w:t>tjenestekarl</w:t>
+      </w:r>
+      <w:proofErr w:type="spellEnd"/>
+      <w:proofErr w:type="gramEnd"/>
       <w:r>
         <w:rPr>
           <w:lang w:val="en-US"/>
@@ -1251,20 +1820,72 @@
         <w:rPr>
           <w:lang w:val="en-US"/>
         </w:rPr>
-        <w:t>rom “famstand“ to “erhverv”</w:t>
-      </w:r>
-    </w:p>
-    <w:p>
-      <w:pPr>
-        <w:rPr>
-          <w:lang w:val="en-US"/>
-        </w:rPr>
-      </w:pPr>
-      <w:r>
-        <w:rPr>
-          <w:lang w:val="en-US"/>
-        </w:rPr>
-        <w:t>The ”famstand” column had a l</w:t>
+        <w:t>rom “</w:t>
+      </w:r>
+      <w:proofErr w:type="spellStart"/>
+      <w:proofErr w:type="gramStart"/>
+      <w:r>
+        <w:rPr>
+          <w:lang w:val="en-US"/>
+        </w:rPr>
+        <w:t>famstand</w:t>
+      </w:r>
+      <w:proofErr w:type="spellEnd"/>
+      <w:r>
+        <w:rPr>
+          <w:lang w:val="en-US"/>
+        </w:rPr>
+        <w:t>“ to</w:t>
+      </w:r>
+      <w:proofErr w:type="gramEnd"/>
+      <w:r>
+        <w:rPr>
+          <w:lang w:val="en-US"/>
+        </w:rPr>
+        <w:t xml:space="preserve"> “</w:t>
+      </w:r>
+      <w:proofErr w:type="spellStart"/>
+      <w:r>
+        <w:rPr>
+          <w:lang w:val="en-US"/>
+        </w:rPr>
+        <w:t>erhverv</w:t>
+      </w:r>
+      <w:proofErr w:type="spellEnd"/>
+      <w:r>
+        <w:rPr>
+          <w:lang w:val="en-US"/>
+        </w:rPr>
+        <w:t>”</w:t>
+      </w:r>
+    </w:p>
+    <w:p>
+      <w:pPr>
+        <w:rPr>
+          <w:lang w:val="en-US"/>
+        </w:rPr>
+      </w:pPr>
+      <w:proofErr w:type="gramStart"/>
+      <w:r>
+        <w:rPr>
+          <w:lang w:val="en-US"/>
+        </w:rPr>
+        <w:t>The ”</w:t>
+      </w:r>
+      <w:proofErr w:type="spellStart"/>
+      <w:r>
+        <w:rPr>
+          <w:lang w:val="en-US"/>
+        </w:rPr>
+        <w:t>famstand</w:t>
+      </w:r>
+      <w:proofErr w:type="spellEnd"/>
+      <w:proofErr w:type="gramEnd"/>
+      <w:r>
+        <w:rPr>
+          <w:lang w:val="en-US"/>
+        </w:rPr>
+        <w:t>” column had a l</w:t>
       </w:r>
       <w:r>
         <w:rPr>
@@ -1276,7 +1897,21 @@
         <w:rPr>
           <w:lang w:val="en-US"/>
         </w:rPr>
-        <w:t>the “erhverv” column by</w:t>
+        <w:t>the “</w:t>
+      </w:r>
+      <w:proofErr w:type="spellStart"/>
+      <w:r>
+        <w:rPr>
+          <w:lang w:val="en-US"/>
+        </w:rPr>
+        <w:t>erhverv</w:t>
+      </w:r>
+      <w:proofErr w:type="spellEnd"/>
+      <w:r>
+        <w:rPr>
+          <w:lang w:val="en-US"/>
+        </w:rPr>
+        <w:t>” column by</w:t>
       </w:r>
       <w:r>
         <w:rPr>
@@ -1288,7 +1923,21 @@
         <w:rPr>
           <w:lang w:val="en-US"/>
         </w:rPr>
-        <w:t>filtering to only show the “tjenestekarl”, then</w:t>
+        <w:t>filtering to only show the “</w:t>
+      </w:r>
+      <w:proofErr w:type="spellStart"/>
+      <w:r>
+        <w:rPr>
+          <w:lang w:val="en-US"/>
+        </w:rPr>
+        <w:t>tjenestekarl</w:t>
+      </w:r>
+      <w:proofErr w:type="spellEnd"/>
+      <w:r>
+        <w:rPr>
+          <w:lang w:val="en-US"/>
+        </w:rPr>
+        <w:t>”, then</w:t>
       </w:r>
       <w:r>
         <w:rPr>
@@ -1300,13 +1949,41 @@
         <w:rPr>
           <w:lang w:val="en-US"/>
         </w:rPr>
-        <w:t xml:space="preserve"> on “erhverv” column </w:t>
-      </w:r>
-      <w:r>
-        <w:rPr>
-          <w:lang w:val="en-US"/>
-        </w:rPr>
-        <w:t xml:space="preserve"> -&gt; </w:t>
+        <w:t xml:space="preserve"> on “</w:t>
+      </w:r>
+      <w:proofErr w:type="spellStart"/>
+      <w:r>
+        <w:rPr>
+          <w:lang w:val="en-US"/>
+        </w:rPr>
+        <w:t>erhverv</w:t>
+      </w:r>
+      <w:proofErr w:type="spellEnd"/>
+      <w:r>
+        <w:rPr>
+          <w:lang w:val="en-US"/>
+        </w:rPr>
+        <w:t xml:space="preserve">” </w:t>
+      </w:r>
+      <w:proofErr w:type="gramStart"/>
+      <w:r>
+        <w:rPr>
+          <w:lang w:val="en-US"/>
+        </w:rPr>
+        <w:t xml:space="preserve">column </w:t>
+      </w:r>
+      <w:r>
+        <w:rPr>
+          <w:lang w:val="en-US"/>
+        </w:rPr>
+        <w:t xml:space="preserve"> -</w:t>
+      </w:r>
+      <w:proofErr w:type="gramEnd"/>
+      <w:r>
+        <w:rPr>
+          <w:lang w:val="en-US"/>
+        </w:rPr>
+        <w:t xml:space="preserve">&gt; </w:t>
       </w:r>
       <w:r>
         <w:rPr>
@@ -1326,7 +2003,22 @@
         <w:rPr>
           <w:lang w:val="en-US"/>
         </w:rPr>
-        <w:t>cells["famstand"].value</w:t>
+        <w:lastRenderedPageBreak/>
+        <w:t>cells["</w:t>
+      </w:r>
+      <w:proofErr w:type="spellStart"/>
+      <w:r>
+        <w:rPr>
+          <w:lang w:val="en-US"/>
+        </w:rPr>
+        <w:t>famstand</w:t>
+      </w:r>
+      <w:proofErr w:type="spellEnd"/>
+      <w:r>
+        <w:rPr>
+          <w:lang w:val="en-US"/>
+        </w:rPr>
+        <w:t>"].value</w:t>
       </w:r>
       <w:r>
         <w:rPr>
@@ -1345,7 +2037,35 @@
         <w:rPr>
           <w:lang w:val="en-US"/>
         </w:rPr>
-        <w:t>This moved all “tjenestekarl” entries to the “erhverv” column.</w:t>
+        <w:t>This moved all “</w:t>
+      </w:r>
+      <w:proofErr w:type="spellStart"/>
+      <w:r>
+        <w:rPr>
+          <w:lang w:val="en-US"/>
+        </w:rPr>
+        <w:t>tjenestekarl</w:t>
+      </w:r>
+      <w:proofErr w:type="spellEnd"/>
+      <w:r>
+        <w:rPr>
+          <w:lang w:val="en-US"/>
+        </w:rPr>
+        <w:t>” entries to the “</w:t>
+      </w:r>
+      <w:proofErr w:type="spellStart"/>
+      <w:r>
+        <w:rPr>
+          <w:lang w:val="en-US"/>
+        </w:rPr>
+        <w:t>erhverv</w:t>
+      </w:r>
+      <w:proofErr w:type="spellEnd"/>
+      <w:r>
+        <w:rPr>
+          <w:lang w:val="en-US"/>
+        </w:rPr>
+        <w:t>” column.</w:t>
       </w:r>
     </w:p>
     <w:sectPr>
@@ -1359,7 +2079,7 @@
 </file>
 
 <file path=word/numbering.xml><?xml version="1.0" encoding="utf-8"?>
-<w:numbering xmlns:wpc="http://schemas.microsoft.com/office/word/2010/wordprocessingCanvas" xmlns:cx="http://schemas.microsoft.com/office/drawing/2014/chartex" xmlns:cx1="http://schemas.microsoft.com/office/drawing/2015/9/8/chartex" xmlns:cx2="http://schemas.microsoft.com/office/drawing/2015/10/21/chartex" xmlns:cx3="http://schemas.microsoft.com/office/drawing/2016/5/9/chartex" xmlns:cx4="http://schemas.microsoft.com/office/drawing/2016/5/10/chartex" xmlns:cx5="http://schemas.microsoft.com/office/drawing/2016/5/11/chartex" xmlns:cx6="http://schemas.microsoft.com/office/drawing/2016/5/12/chartex" xmlns:cx7="http://schemas.microsoft.com/office/drawing/2016/5/13/chartex" xmlns:cx8="http://schemas.microsoft.com/office/drawing/2016/5/14/chartex" xmlns:mc="http://schemas.openxmlformats.org/markup-compatibility/2006" xmlns:aink="http://schemas.microsoft.com/office/drawing/2016/ink" xmlns:am3d="http://schemas.microsoft.com/office/drawing/2017/model3d" xmlns:o="urn:schemas-microsoft-com:office:office" xmlns:oel="http://schemas.microsoft.com/office/2019/extlst" xmlns:r="http://schemas.openxmlformats.org/officeDocument/2006/relationships" xmlns:m="http://schemas.openxmlformats.org/officeDocument/2006/math" xmlns:v="urn:schemas-microsoft-com:vml" xmlns:wp14="http://schemas.microsoft.com/office/word/2010/wordprocessingDrawing" xmlns:wp="http://schemas.openxmlformats.org/drawingml/2006/wordprocessingDrawing" xmlns:w10="urn:schemas-microsoft-com:office:word" xmlns:w="http://schemas.openxmlformats.org/wordprocessingml/2006/main" xmlns:w14="http://schemas.microsoft.com/office/word/2010/wordml" xmlns:w15="http://schemas.microsoft.com/office/word/2012/wordml" xmlns:w16cex="http://schemas.microsoft.com/office/word/2018/wordml/cex" xmlns:w16cid="http://schemas.microsoft.com/office/word/2016/wordml/cid" xmlns:w16="http://schemas.microsoft.com/office/word/2018/wordml" xmlns:w16du="http://schemas.microsoft.com/office/word/2023/wordml/word16du" xmlns:w16sdtdh="http://schemas.microsoft.com/office/word/2020/wordml/sdtdatahash" xmlns:w16sdtfl="http://schemas.microsoft.com/office/word/2024/wordml/sdtformatlock" xmlns:w16se="http://schemas.microsoft.com/office/word/2015/wordml/symex" xmlns:wpg="http://schemas.microsoft.com/office/word/2010/wordprocessingGroup" xmlns:wpi="http://schemas.microsoft.com/office/word/2010/wordprocessingInk" xmlns:wne="http://schemas.microsoft.com/office/word/2006/wordml" xmlns:wps="http://schemas.microsoft.com/office/word/2010/wordprocessingShape" mc:Ignorable="w14 w15 w16se w16cid w16 w16cex w16sdtdh w16sdtfl w16du wp14">
+<w:numbering xmlns:wpc="http://schemas.microsoft.com/office/word/2010/wordprocessingCanvas" xmlns:cx="http://schemas.microsoft.com/office/drawing/2014/chartex" xmlns:cx1="http://schemas.microsoft.com/office/drawing/2015/9/8/chartex" xmlns:cx2="http://schemas.microsoft.com/office/drawing/2015/10/21/chartex" xmlns:cx3="http://schemas.microsoft.com/office/drawing/2016/5/9/chartex" xmlns:cx4="http://schemas.microsoft.com/office/drawing/2016/5/10/chartex" xmlns:cx5="http://schemas.microsoft.com/office/drawing/2016/5/11/chartex" xmlns:cx6="http://schemas.microsoft.com/office/drawing/2016/5/12/chartex" xmlns:cx7="http://schemas.microsoft.com/office/drawing/2016/5/13/chartex" xmlns:cx8="http://schemas.microsoft.com/office/drawing/2016/5/14/chartex" xmlns:mc="http://schemas.openxmlformats.org/markup-compatibility/2006" xmlns:aink="http://schemas.microsoft.com/office/drawing/2016/ink" xmlns:am3d="http://schemas.microsoft.com/office/drawing/2017/model3d" xmlns:o="urn:schemas-microsoft-com:office:office" xmlns:oel="http://schemas.microsoft.com/office/2019/extlst" xmlns:r="http://schemas.openxmlformats.org/officeDocument/2006/relationships" xmlns:m="http://schemas.openxmlformats.org/officeDocument/2006/math" xmlns:v="urn:schemas-microsoft-com:vml" xmlns:wp14="http://schemas.microsoft.com/office/word/2010/wordprocessingDrawing" xmlns:wp="http://schemas.openxmlformats.org/drawingml/2006/wordprocessingDrawing" xmlns:w10="urn:schemas-microsoft-com:office:word" xmlns:w="http://schemas.openxmlformats.org/wordprocessingml/2006/main" xmlns:w14="http://schemas.microsoft.com/office/word/2010/wordml" xmlns:w15="http://schemas.microsoft.com/office/word/2012/wordml" xmlns:w16cei="http://schemas.microsoft.com/office/word/2026/wordml/cei" xmlns:w16cex="http://schemas.microsoft.com/office/word/2018/wordml/cex" xmlns:w16cid="http://schemas.microsoft.com/office/word/2016/wordml/cid" xmlns:w16="http://schemas.microsoft.com/office/word/2018/wordml" xmlns:w16du="http://schemas.microsoft.com/office/word/2023/wordml/word16du" xmlns:w16sdtdh="http://schemas.microsoft.com/office/word/2020/wordml/sdtdatahash" xmlns:w16sdtfl="http://schemas.microsoft.com/office/word/2024/wordml/sdtformatlock" xmlns:w16se="http://schemas.microsoft.com/office/word/2015/wordml/symex" xmlns:wpg="http://schemas.microsoft.com/office/word/2010/wordprocessingGroup" xmlns:wpi="http://schemas.microsoft.com/office/word/2010/wordprocessingInk" xmlns:wne="http://schemas.microsoft.com/office/word/2006/wordml" xmlns:wps="http://schemas.microsoft.com/office/word/2010/wordprocessingShape" mc:Ignorable="w14 w15 w16se w16cid w16 w16cex w16sdtdh w16sdtfl w16du wp14">
   <w:abstractNum w:abstractNumId="0" w15:restartNumberingAfterBreak="0">
     <w:nsid w:val="21381306"/>
     <w:multiLevelType w:val="multilevel"/>
@@ -2617,7 +3337,6 @@
   <w:style w:type="character" w:default="1" w:styleId="Standardskrifttypeiafsnit">
     <w:name w:val="Default Paragraph Font"/>
     <w:uiPriority w:val="1"/>
-    <w:semiHidden/>
     <w:unhideWhenUsed/>
   </w:style>
   <w:style w:type="table" w:default="1" w:styleId="Tabel-Normal">

</xml_diff>